<commit_message>
Run filtered dependency models in conda base
</commit_message>
<xml_diff>
--- a/supervised_monosaccharides_exclude_rha5/monosaccharide_softsensor_exclude_rha5_refined_dependencies_report.docx
+++ b/supervised_monosaccharides_exclude_rha5/monosaccharide_softsensor_exclude_rha5_refined_dependencies_report.docx
@@ -1151,21 +1151,16 @@
       </w:r>
     </w:p>
     <w:p>
-      <w:r>
-        <w:br w:type="page"/>
-      </w:r>
-    </w:p>
-    <w:p>
       <w:pPr>
-        <w:pStyle w:val="Heading1"/>
+        <w:pStyle w:val="Heading2"/>
       </w:pPr>
       <w:r>
-        <w:t xml:space="preserve">6. Raman Preprocessing and EEM PARAFAC Extension</w:t>
-      </w:r>
-    </w:p>
-    <w:p>
-      <w:r>
-        <w:t xml:space="preserve">The extension added a more spectroscopy-aware Raman preprocessing path and interpretable EEM PARAFAC components. Raman preprocessing records each model's preprocessing_config, so performance can be traced to the exact sequence of cosmic-spike removal, ALS baseline correction, smoothing/derivative choice, SNV, and optional area normalization. The EEM PARAFAC script fits ranks 2-8 and selects the rank by reconstruction error, split-half stability, and prediction performance.</w:t>
+        <w:t xml:space="preserve">Dependency-Backed Model Comparison</w:t>
+      </w:r>
+    </w:p>
+    <w:p>
+      <w:r>
+        <w:t xml:space="preserve">This comparison uses Conda base packages when available: scikit-learn PLSR/SVR and XGBoost.</w:t>
       </w:r>
     </w:p>
     <w:tbl>
@@ -1196,6 +1191,782 @@
               <w:rPr>
                 <w:b/>
               </w:rPr>
+              <w:t xml:space="preserve">Feature set</w:t>
+            </w:r>
+          </w:p>
+        </w:tc>
+        <w:tc>
+          <w:tcPr>
+            <w:shd w:fill="EEF3F8"/>
+          </w:tcPr>
+          <w:p>
+            <w:r>
+              <w:rPr>
+                <w:b/>
+              </w:rPr>
+              <w:t xml:space="preserve">Model</w:t>
+            </w:r>
+          </w:p>
+        </w:tc>
+        <w:tc>
+          <w:tcPr>
+            <w:shd w:fill="EEF3F8"/>
+          </w:tcPr>
+          <w:p>
+            <w:r>
+              <w:rPr>
+                <w:b/>
+              </w:rPr>
+              <w:t xml:space="preserve">Config</w:t>
+            </w:r>
+          </w:p>
+        </w:tc>
+        <w:tc>
+          <w:tcPr>
+            <w:shd w:fill="EEF3F8"/>
+          </w:tcPr>
+          <w:p>
+            <w:r>
+              <w:rPr>
+                <w:b/>
+              </w:rPr>
+              <w:t xml:space="preserve">RMSE</w:t>
+            </w:r>
+          </w:p>
+        </w:tc>
+        <w:tc>
+          <w:tcPr>
+            <w:shd w:fill="EEF3F8"/>
+          </w:tcPr>
+          <w:p>
+            <w:r>
+              <w:rPr>
+                <w:b/>
+              </w:rPr>
+              <w:t xml:space="preserve">R2</w:t>
+            </w:r>
+          </w:p>
+        </w:tc>
+      </w:tr>
+      <w:tr>
+        <w:tc>
+          <w:tcPr/>
+          <w:p>
+            <w:r>
+              <w:rPr/>
+              <w:t xml:space="preserve">Rhamnose</w:t>
+            </w:r>
+          </w:p>
+        </w:tc>
+        <w:tc>
+          <w:tcPr/>
+          <w:p>
+            <w:r>
+              <w:rPr/>
+              <w:t xml:space="preserve">fusion_full</w:t>
+            </w:r>
+          </w:p>
+        </w:tc>
+        <w:tc>
+          <w:tcPr/>
+          <w:p>
+            <w:r>
+              <w:rPr/>
+              <w:t xml:space="preserve">sklearn_plsr</w:t>
+            </w:r>
+          </w:p>
+        </w:tc>
+        <w:tc>
+          <w:tcPr/>
+          <w:p>
+            <w:r>
+              <w:rPr/>
+              <w:t xml:space="preserve">n_components=5,max_features=192</w:t>
+            </w:r>
+          </w:p>
+        </w:tc>
+        <w:tc>
+          <w:tcPr/>
+          <w:p>
+            <w:r>
+              <w:rPr/>
+              <w:t xml:space="preserve">0.3598</w:t>
+            </w:r>
+          </w:p>
+        </w:tc>
+        <w:tc>
+          <w:tcPr/>
+          <w:p>
+            <w:r>
+              <w:rPr/>
+              <w:t xml:space="preserve">0.063</w:t>
+            </w:r>
+          </w:p>
+        </w:tc>
+      </w:tr>
+      <w:tr>
+        <w:tc>
+          <w:tcPr/>
+          <w:p>
+            <w:r>
+              <w:rPr/>
+              <w:t xml:space="preserve">Rhamnose</w:t>
+            </w:r>
+          </w:p>
+        </w:tc>
+        <w:tc>
+          <w:tcPr/>
+          <w:p>
+            <w:r>
+              <w:rPr/>
+              <w:t xml:space="preserve">fusion_full</w:t>
+            </w:r>
+          </w:p>
+        </w:tc>
+        <w:tc>
+          <w:tcPr/>
+          <w:p>
+            <w:r>
+              <w:rPr/>
+              <w:t xml:space="preserve">xgboost</w:t>
+            </w:r>
+          </w:p>
+        </w:tc>
+        <w:tc>
+          <w:tcPr/>
+          <w:p>
+            <w:r>
+              <w:rPr/>
+              <w:t xml:space="preserve">n_estimators=200,max_depth=2,learning_rate=0.05,max_features=192</w:t>
+            </w:r>
+          </w:p>
+        </w:tc>
+        <w:tc>
+          <w:tcPr/>
+          <w:p>
+            <w:r>
+              <w:rPr/>
+              <w:t xml:space="preserve">0.3628</w:t>
+            </w:r>
+          </w:p>
+        </w:tc>
+        <w:tc>
+          <w:tcPr/>
+          <w:p>
+            <w:r>
+              <w:rPr/>
+              <w:t xml:space="preserve">0.082</w:t>
+            </w:r>
+          </w:p>
+        </w:tc>
+      </w:tr>
+      <w:tr>
+        <w:tc>
+          <w:tcPr/>
+          <w:p>
+            <w:r>
+              <w:rPr/>
+              <w:t xml:space="preserve">Rhamnose</w:t>
+            </w:r>
+          </w:p>
+        </w:tc>
+        <w:tc>
+          <w:tcPr/>
+          <w:p>
+            <w:r>
+              <w:rPr/>
+              <w:t xml:space="preserve">fusion_full</w:t>
+            </w:r>
+          </w:p>
+        </w:tc>
+        <w:tc>
+          <w:tcPr/>
+          <w:p>
+            <w:r>
+              <w:rPr/>
+              <w:t xml:space="preserve">sklearn_plsr</w:t>
+            </w:r>
+          </w:p>
+        </w:tc>
+        <w:tc>
+          <w:tcPr/>
+          <w:p>
+            <w:r>
+              <w:rPr/>
+              <w:t xml:space="preserve">n_components=2,max_features=192</w:t>
+            </w:r>
+          </w:p>
+        </w:tc>
+        <w:tc>
+          <w:tcPr/>
+          <w:p>
+            <w:r>
+              <w:rPr/>
+              <w:t xml:space="preserve">0.3692</w:t>
+            </w:r>
+          </w:p>
+        </w:tc>
+        <w:tc>
+          <w:tcPr/>
+          <w:p>
+            <w:r>
+              <w:rPr/>
+              <w:t xml:space="preserve">0.042</w:t>
+            </w:r>
+          </w:p>
+        </w:tc>
+      </w:tr>
+      <w:tr>
+        <w:tc>
+          <w:tcPr/>
+          <w:p>
+            <w:r>
+              <w:rPr/>
+              <w:t xml:space="preserve">Rhamnose</w:t>
+            </w:r>
+          </w:p>
+        </w:tc>
+        <w:tc>
+          <w:tcPr/>
+          <w:p>
+            <w:r>
+              <w:rPr/>
+              <w:t xml:space="preserve">eem_full</w:t>
+            </w:r>
+          </w:p>
+        </w:tc>
+        <w:tc>
+          <w:tcPr/>
+          <w:p>
+            <w:r>
+              <w:rPr/>
+              <w:t xml:space="preserve">xgboost</w:t>
+            </w:r>
+          </w:p>
+        </w:tc>
+        <w:tc>
+          <w:tcPr/>
+          <w:p>
+            <w:r>
+              <w:rPr/>
+              <w:t xml:space="preserve">n_estimators=200,max_depth=2,learning_rate=0.05,max_features=192</w:t>
+            </w:r>
+          </w:p>
+        </w:tc>
+        <w:tc>
+          <w:tcPr/>
+          <w:p>
+            <w:r>
+              <w:rPr/>
+              <w:t xml:space="preserve">0.3827</w:t>
+            </w:r>
+          </w:p>
+        </w:tc>
+        <w:tc>
+          <w:tcPr/>
+          <w:p>
+            <w:r>
+              <w:rPr/>
+              <w:t xml:space="preserve">0.109</w:t>
+            </w:r>
+          </w:p>
+        </w:tc>
+      </w:tr>
+      <w:tr>
+        <w:tc>
+          <w:tcPr/>
+          <w:p>
+            <w:r>
+              <w:rPr/>
+              <w:t xml:space="preserve">Rhamnose</w:t>
+            </w:r>
+          </w:p>
+        </w:tc>
+        <w:tc>
+          <w:tcPr/>
+          <w:p>
+            <w:r>
+              <w:rPr/>
+              <w:t xml:space="preserve">eem_full</w:t>
+            </w:r>
+          </w:p>
+        </w:tc>
+        <w:tc>
+          <w:tcPr/>
+          <w:p>
+            <w:r>
+              <w:rPr/>
+              <w:t xml:space="preserve">sklearn_plsr</w:t>
+            </w:r>
+          </w:p>
+        </w:tc>
+        <w:tc>
+          <w:tcPr/>
+          <w:p>
+            <w:r>
+              <w:rPr/>
+              <w:t xml:space="preserve">n_components=2,max_features=192</w:t>
+            </w:r>
+          </w:p>
+        </w:tc>
+        <w:tc>
+          <w:tcPr/>
+          <w:p>
+            <w:r>
+              <w:rPr/>
+              <w:t xml:space="preserve">0.3872</w:t>
+            </w:r>
+          </w:p>
+        </w:tc>
+        <w:tc>
+          <w:tcPr/>
+          <w:p>
+            <w:r>
+              <w:rPr/>
+              <w:t xml:space="preserve">0.110</w:t>
+            </w:r>
+          </w:p>
+        </w:tc>
+      </w:tr>
+      <w:tr>
+        <w:tc>
+          <w:tcPr/>
+          <w:p>
+            <w:r>
+              <w:rPr/>
+              <w:t xml:space="preserve">Rhamnose</w:t>
+            </w:r>
+          </w:p>
+        </w:tc>
+        <w:tc>
+          <w:tcPr/>
+          <w:p>
+            <w:r>
+              <w:rPr/>
+              <w:t xml:space="preserve">eem_full</w:t>
+            </w:r>
+          </w:p>
+        </w:tc>
+        <w:tc>
+          <w:tcPr/>
+          <w:p>
+            <w:r>
+              <w:rPr/>
+              <w:t xml:space="preserve">sklearn_svr</w:t>
+            </w:r>
+          </w:p>
+        </w:tc>
+        <w:tc>
+          <w:tcPr/>
+          <w:p>
+            <w:r>
+              <w:rPr/>
+              <w:t xml:space="preserve">kernel=rbf,C=10,epsilon=0.05,max_features=192</w:t>
+            </w:r>
+          </w:p>
+        </w:tc>
+        <w:tc>
+          <w:tcPr/>
+          <w:p>
+            <w:r>
+              <w:rPr/>
+              <w:t xml:space="preserve">0.4007</w:t>
+            </w:r>
+          </w:p>
+        </w:tc>
+        <w:tc>
+          <w:tcPr/>
+          <w:p>
+            <w:r>
+              <w:rPr/>
+              <w:t xml:space="preserve">0.067</w:t>
+            </w:r>
+          </w:p>
+        </w:tc>
+      </w:tr>
+      <w:tr>
+        <w:tc>
+          <w:tcPr/>
+          <w:p>
+            <w:r>
+              <w:rPr/>
+              <w:t xml:space="preserve">Rhamnose</w:t>
+            </w:r>
+          </w:p>
+        </w:tc>
+        <w:tc>
+          <w:tcPr/>
+          <w:p>
+            <w:r>
+              <w:rPr/>
+              <w:t xml:space="preserve">fusion_interpretable</w:t>
+            </w:r>
+          </w:p>
+        </w:tc>
+        <w:tc>
+          <w:tcPr/>
+          <w:p>
+            <w:r>
+              <w:rPr/>
+              <w:t xml:space="preserve">sklearn_svr</w:t>
+            </w:r>
+          </w:p>
+        </w:tc>
+        <w:tc>
+          <w:tcPr/>
+          <w:p>
+            <w:r>
+              <w:rPr/>
+              <w:t xml:space="preserve">kernel=rbf,C=10,epsilon=0.05,max_features=192</w:t>
+            </w:r>
+          </w:p>
+        </w:tc>
+        <w:tc>
+          <w:tcPr/>
+          <w:p>
+            <w:r>
+              <w:rPr/>
+              <w:t xml:space="preserve">0.4057</w:t>
+            </w:r>
+          </w:p>
+        </w:tc>
+        <w:tc>
+          <w:tcPr/>
+          <w:p>
+            <w:r>
+              <w:rPr/>
+              <w:t xml:space="preserve">-0.142</w:t>
+            </w:r>
+          </w:p>
+        </w:tc>
+      </w:tr>
+      <w:tr>
+        <w:tc>
+          <w:tcPr/>
+          <w:p>
+            <w:r>
+              <w:rPr/>
+              <w:t xml:space="preserve">Rhamnose</w:t>
+            </w:r>
+          </w:p>
+        </w:tc>
+        <w:tc>
+          <w:tcPr/>
+          <w:p>
+            <w:r>
+              <w:rPr/>
+              <w:t xml:space="preserve">fusion_full</w:t>
+            </w:r>
+          </w:p>
+        </w:tc>
+        <w:tc>
+          <w:tcPr/>
+          <w:p>
+            <w:r>
+              <w:rPr/>
+              <w:t xml:space="preserve">sklearn_svr</w:t>
+            </w:r>
+          </w:p>
+        </w:tc>
+        <w:tc>
+          <w:tcPr/>
+          <w:p>
+            <w:r>
+              <w:rPr/>
+              <w:t xml:space="preserve">kernel=rbf,C=10,epsilon=0.05,max_features=192</w:t>
+            </w:r>
+          </w:p>
+        </w:tc>
+        <w:tc>
+          <w:tcPr/>
+          <w:p>
+            <w:r>
+              <w:rPr/>
+              <w:t xml:space="preserve">0.4086</w:t>
+            </w:r>
+          </w:p>
+        </w:tc>
+        <w:tc>
+          <w:tcPr/>
+          <w:p>
+            <w:r>
+              <w:rPr/>
+              <w:t xml:space="preserve">-0.201</w:t>
+            </w:r>
+          </w:p>
+        </w:tc>
+      </w:tr>
+      <w:tr>
+        <w:tc>
+          <w:tcPr/>
+          <w:p>
+            <w:r>
+              <w:rPr/>
+              <w:t xml:space="preserve">Rhamnose</w:t>
+            </w:r>
+          </w:p>
+        </w:tc>
+        <w:tc>
+          <w:tcPr/>
+          <w:p>
+            <w:r>
+              <w:rPr/>
+              <w:t xml:space="preserve">eem_full</w:t>
+            </w:r>
+          </w:p>
+        </w:tc>
+        <w:tc>
+          <w:tcPr/>
+          <w:p>
+            <w:r>
+              <w:rPr/>
+              <w:t xml:space="preserve">sklearn_plsr</w:t>
+            </w:r>
+          </w:p>
+        </w:tc>
+        <w:tc>
+          <w:tcPr/>
+          <w:p>
+            <w:r>
+              <w:rPr/>
+              <w:t xml:space="preserve">n_components=5,max_features=192</w:t>
+            </w:r>
+          </w:p>
+        </w:tc>
+        <w:tc>
+          <w:tcPr/>
+          <w:p>
+            <w:r>
+              <w:rPr/>
+              <w:t xml:space="preserve">0.4107</w:t>
+            </w:r>
+          </w:p>
+        </w:tc>
+        <w:tc>
+          <w:tcPr/>
+          <w:p>
+            <w:r>
+              <w:rPr/>
+              <w:t xml:space="preserve">-0.028</w:t>
+            </w:r>
+          </w:p>
+        </w:tc>
+      </w:tr>
+      <w:tr>
+        <w:tc>
+          <w:tcPr/>
+          <w:p>
+            <w:r>
+              <w:rPr/>
+              <w:t xml:space="preserve">Rhamnose</w:t>
+            </w:r>
+          </w:p>
+        </w:tc>
+        <w:tc>
+          <w:tcPr/>
+          <w:p>
+            <w:r>
+              <w:rPr/>
+              <w:t xml:space="preserve">eem_interpretable</w:t>
+            </w:r>
+          </w:p>
+        </w:tc>
+        <w:tc>
+          <w:tcPr/>
+          <w:p>
+            <w:r>
+              <w:rPr/>
+              <w:t xml:space="preserve">sklearn_plsr</w:t>
+            </w:r>
+          </w:p>
+        </w:tc>
+        <w:tc>
+          <w:tcPr/>
+          <w:p>
+            <w:r>
+              <w:rPr/>
+              <w:t xml:space="preserve">n_components=2,max_features=192</w:t>
+            </w:r>
+          </w:p>
+        </w:tc>
+        <w:tc>
+          <w:tcPr/>
+          <w:p>
+            <w:r>
+              <w:rPr/>
+              <w:t xml:space="preserve">0.4209</w:t>
+            </w:r>
+          </w:p>
+        </w:tc>
+        <w:tc>
+          <w:tcPr/>
+          <w:p>
+            <w:r>
+              <w:rPr/>
+              <w:t xml:space="preserve">-0.017</w:t>
+            </w:r>
+          </w:p>
+        </w:tc>
+      </w:tr>
+      <w:tr>
+        <w:tc>
+          <w:tcPr/>
+          <w:p>
+            <w:r>
+              <w:rPr/>
+              <w:t xml:space="preserve">Rhamnose</w:t>
+            </w:r>
+          </w:p>
+        </w:tc>
+        <w:tc>
+          <w:tcPr/>
+          <w:p>
+            <w:r>
+              <w:rPr/>
+              <w:t xml:space="preserve">fusion_interpretable</w:t>
+            </w:r>
+          </w:p>
+        </w:tc>
+        <w:tc>
+          <w:tcPr/>
+          <w:p>
+            <w:r>
+              <w:rPr/>
+              <w:t xml:space="preserve">xgboost</w:t>
+            </w:r>
+          </w:p>
+        </w:tc>
+        <w:tc>
+          <w:tcPr/>
+          <w:p>
+            <w:r>
+              <w:rPr/>
+              <w:t xml:space="preserve">n_estimators=200,max_depth=2,learning_rate=0.05,max_features=192</w:t>
+            </w:r>
+          </w:p>
+        </w:tc>
+        <w:tc>
+          <w:tcPr/>
+          <w:p>
+            <w:r>
+              <w:rPr/>
+              <w:t xml:space="preserve">0.4364</w:t>
+            </w:r>
+          </w:p>
+        </w:tc>
+        <w:tc>
+          <w:tcPr/>
+          <w:p>
+            <w:r>
+              <w:rPr/>
+              <w:t xml:space="preserve">-0.530</w:t>
+            </w:r>
+          </w:p>
+        </w:tc>
+      </w:tr>
+      <w:tr>
+        <w:tc>
+          <w:tcPr/>
+          <w:p>
+            <w:r>
+              <w:rPr/>
+              <w:t xml:space="preserve">Rhamnose</w:t>
+            </w:r>
+          </w:p>
+        </w:tc>
+        <w:tc>
+          <w:tcPr/>
+          <w:p>
+            <w:r>
+              <w:rPr/>
+              <w:t xml:space="preserve">eem_interpretable</w:t>
+            </w:r>
+          </w:p>
+        </w:tc>
+        <w:tc>
+          <w:tcPr/>
+          <w:p>
+            <w:r>
+              <w:rPr/>
+              <w:t xml:space="preserve">xgboost</w:t>
+            </w:r>
+          </w:p>
+        </w:tc>
+        <w:tc>
+          <w:tcPr/>
+          <w:p>
+            <w:r>
+              <w:rPr/>
+              <w:t xml:space="preserve">n_estimators=200,max_depth=2,learning_rate=0.05,max_features=192</w:t>
+            </w:r>
+          </w:p>
+        </w:tc>
+        <w:tc>
+          <w:tcPr/>
+          <w:p>
+            <w:r>
+              <w:rPr/>
+              <w:t xml:space="preserve">0.4388</w:t>
+            </w:r>
+          </w:p>
+        </w:tc>
+        <w:tc>
+          <w:tcPr/>
+          <w:p>
+            <w:r>
+              <w:rPr/>
+              <w:t xml:space="preserve">-0.122</w:t>
+            </w:r>
+          </w:p>
+        </w:tc>
+      </w:tr>
+    </w:tbl>
+    <w:p>
+      <w:r>
+        <w:br w:type="page"/>
+      </w:r>
+    </w:p>
+    <w:p>
+      <w:pPr>
+        <w:pStyle w:val="Heading1"/>
+      </w:pPr>
+      <w:r>
+        <w:t xml:space="preserve">6. Raman Preprocessing and EEM PARAFAC Extension</w:t>
+      </w:r>
+    </w:p>
+    <w:p>
+      <w:r>
+        <w:t xml:space="preserve">The extension added a more spectroscopy-aware Raman preprocessing path and interpretable EEM PARAFAC components. Raman preprocessing records each model's preprocessing_config, so performance can be traced to the exact sequence of cosmic-spike removal, ALS baseline correction, smoothing/derivative choice, SNV, and optional area normalization. The EEM PARAFAC script fits ranks 2-8 and selects the rank by reconstruction error, split-half stability, and prediction performance.</w:t>
+      </w:r>
+    </w:p>
+    <w:tbl>
+      <w:tblPr>
+        <w:tblStyle w:val="TableGrid"/>
+        <w:tblW w:w="0" w:type="auto"/>
+      </w:tblPr>
+      <w:tr>
+        <w:tc>
+          <w:tcPr>
+            <w:shd w:fill="EEF3F8"/>
+          </w:tcPr>
+          <w:p>
+            <w:r>
+              <w:rPr>
+                <w:b/>
+              </w:rPr>
+              <w:t xml:space="preserve">Target</w:t>
+            </w:r>
+          </w:p>
+        </w:tc>
+        <w:tc>
+          <w:tcPr>
+            <w:shd w:fill="EEF3F8"/>
+          </w:tcPr>
+          <w:p>
+            <w:r>
+              <w:rPr>
+                <w:b/>
+              </w:rPr>
               <w:t xml:space="preserve">Best extension feature set</w:t>
             </w:r>
           </w:p>
@@ -1281,7 +2052,137 @@
           <w:p>
             <w:r>
               <w:rPr/>
-              <w:t xml:space="preserve">eem_parafac_scores</w:t>
+              <w:t xml:space="preserve">parafac_raman_fusion_als_sg2_snv</w:t>
+            </w:r>
+          </w:p>
+        </w:tc>
+        <w:tc>
+          <w:tcPr/>
+          <w:p>
+            <w:r>
+              <w:rPr/>
+              <w:t xml:space="preserve">weighted_knn</w:t>
+            </w:r>
+          </w:p>
+        </w:tc>
+        <w:tc>
+          <w:tcPr/>
+          <w:p>
+            <w:r>
+              <w:rPr/>
+              <w:t xml:space="preserve">0.4933</w:t>
+            </w:r>
+          </w:p>
+        </w:tc>
+        <w:tc>
+          <w:tcPr/>
+          <w:p>
+            <w:r>
+              <w:rPr/>
+              <w:t xml:space="preserve">0.4136</w:t>
+            </w:r>
+          </w:p>
+        </w:tc>
+        <w:tc>
+          <w:tcPr/>
+          <w:p>
+            <w:r>
+              <w:rPr/>
+              <w:t xml:space="preserve">-19.3%</w:t>
+            </w:r>
+          </w:p>
+        </w:tc>
+        <w:tc>
+          <w:tcPr/>
+          <w:p>
+            <w:r>
+              <w:rPr/>
+              <w:t xml:space="preserve">False</w:t>
+            </w:r>
+          </w:p>
+        </w:tc>
+      </w:tr>
+      <w:tr>
+        <w:tc>
+          <w:tcPr/>
+          <w:p>
+            <w:r>
+              <w:rPr/>
+              <w:t xml:space="preserve">Xylose</w:t>
+            </w:r>
+          </w:p>
+        </w:tc>
+        <w:tc>
+          <w:tcPr/>
+          <w:p>
+            <w:r>
+              <w:rPr/>
+              <w:t xml:space="preserve">raman_preprocessed_als_sg2_snv</w:t>
+            </w:r>
+          </w:p>
+        </w:tc>
+        <w:tc>
+          <w:tcPr/>
+          <w:p>
+            <w:r>
+              <w:rPr/>
+              <w:t xml:space="preserve">weighted_knn</w:t>
+            </w:r>
+          </w:p>
+        </w:tc>
+        <w:tc>
+          <w:tcPr/>
+          <w:p>
+            <w:r>
+              <w:rPr/>
+              <w:t xml:space="preserve">0.5544</w:t>
+            </w:r>
+          </w:p>
+        </w:tc>
+        <w:tc>
+          <w:tcPr/>
+          <w:p>
+            <w:r>
+              <w:rPr/>
+              <w:t xml:space="preserve">0.4580</w:t>
+            </w:r>
+          </w:p>
+        </w:tc>
+        <w:tc>
+          <w:tcPr/>
+          <w:p>
+            <w:r>
+              <w:rPr/>
+              <w:t xml:space="preserve">-21.0%</w:t>
+            </w:r>
+          </w:p>
+        </w:tc>
+        <w:tc>
+          <w:tcPr/>
+          <w:p>
+            <w:r>
+              <w:rPr/>
+              <w:t xml:space="preserve">False</w:t>
+            </w:r>
+          </w:p>
+        </w:tc>
+      </w:tr>
+      <w:tr>
+        <w:tc>
+          <w:tcPr/>
+          <w:p>
+            <w:r>
+              <w:rPr/>
+              <w:t xml:space="preserve">Glucose</w:t>
+            </w:r>
+          </w:p>
+        </w:tc>
+        <w:tc>
+          <w:tcPr/>
+          <w:p>
+            <w:r>
+              <w:rPr/>
+              <w:t xml:space="preserve">parafac_raman_fusion_als_sg0_snv_area</w:t>
             </w:r>
           </w:p>
         </w:tc>
@@ -1299,137 +2200,7 @@
           <w:p>
             <w:r>
               <w:rPr/>
-              <w:t xml:space="preserve">0.4588</w:t>
-            </w:r>
-          </w:p>
-        </w:tc>
-        <w:tc>
-          <w:tcPr/>
-          <w:p>
-            <w:r>
-              <w:rPr/>
-              <w:t xml:space="preserve">0.4136</w:t>
-            </w:r>
-          </w:p>
-        </w:tc>
-        <w:tc>
-          <w:tcPr/>
-          <w:p>
-            <w:r>
-              <w:rPr/>
-              <w:t xml:space="preserve">-10.9%</w:t>
-            </w:r>
-          </w:p>
-        </w:tc>
-        <w:tc>
-          <w:tcPr/>
-          <w:p>
-            <w:r>
-              <w:rPr/>
-              <w:t xml:space="preserve">False</w:t>
-            </w:r>
-          </w:p>
-        </w:tc>
-      </w:tr>
-      <w:tr>
-        <w:tc>
-          <w:tcPr/>
-          <w:p>
-            <w:r>
-              <w:rPr/>
-              <w:t xml:space="preserve">Xylose</w:t>
-            </w:r>
-          </w:p>
-        </w:tc>
-        <w:tc>
-          <w:tcPr/>
-          <w:p>
-            <w:r>
-              <w:rPr/>
-              <w:t xml:space="preserve">raman_preprocessed_als_sg2_snv</w:t>
-            </w:r>
-          </w:p>
-        </w:tc>
-        <w:tc>
-          <w:tcPr/>
-          <w:p>
-            <w:r>
-              <w:rPr/>
-              <w:t xml:space="preserve">weighted_knn</w:t>
-            </w:r>
-          </w:p>
-        </w:tc>
-        <w:tc>
-          <w:tcPr/>
-          <w:p>
-            <w:r>
-              <w:rPr/>
-              <w:t xml:space="preserve">0.5526</w:t>
-            </w:r>
-          </w:p>
-        </w:tc>
-        <w:tc>
-          <w:tcPr/>
-          <w:p>
-            <w:r>
-              <w:rPr/>
-              <w:t xml:space="preserve">0.4580</w:t>
-            </w:r>
-          </w:p>
-        </w:tc>
-        <w:tc>
-          <w:tcPr/>
-          <w:p>
-            <w:r>
-              <w:rPr/>
-              <w:t xml:space="preserve">-20.7%</w:t>
-            </w:r>
-          </w:p>
-        </w:tc>
-        <w:tc>
-          <w:tcPr/>
-          <w:p>
-            <w:r>
-              <w:rPr/>
-              <w:t xml:space="preserve">False</w:t>
-            </w:r>
-          </w:p>
-        </w:tc>
-      </w:tr>
-      <w:tr>
-        <w:tc>
-          <w:tcPr/>
-          <w:p>
-            <w:r>
-              <w:rPr/>
-              <w:t xml:space="preserve">Glucose</w:t>
-            </w:r>
-          </w:p>
-        </w:tc>
-        <w:tc>
-          <w:tcPr/>
-          <w:p>
-            <w:r>
-              <w:rPr/>
-              <w:t xml:space="preserve">eem_parafac_scores</w:t>
-            </w:r>
-          </w:p>
-        </w:tc>
-        <w:tc>
-          <w:tcPr/>
-          <w:p>
-            <w:r>
-              <w:rPr/>
-              <w:t xml:space="preserve">krr</w:t>
-            </w:r>
-          </w:p>
-        </w:tc>
-        <w:tc>
-          <w:tcPr/>
-          <w:p>
-            <w:r>
-              <w:rPr/>
-              <w:t xml:space="preserve">0.7190</w:t>
+              <w:t xml:space="preserve">0.7058</w:t>
             </w:r>
           </w:p>
         </w:tc>
@@ -1447,7 +2218,7 @@
           <w:p>
             <w:r>
               <w:rPr/>
-              <w:t xml:space="preserve">-28.6%</w:t>
+              <w:t xml:space="preserve">-26.3%</w:t>
             </w:r>
           </w:p>
         </w:tc>
@@ -1582,25 +2353,213 @@
           <w:p>
             <w:r>
               <w:rPr/>
-              <w:t xml:space="preserve">3.224822</w:t>
-            </w:r>
-          </w:p>
-        </w:tc>
-        <w:tc>
-          <w:tcPr/>
-          <w:p>
-            <w:r>
-              <w:rPr/>
-              <w:t xml:space="preserve">0.49878435</w:t>
-            </w:r>
-          </w:p>
-        </w:tc>
-        <w:tc>
-          <w:tcPr/>
-          <w:p>
-            <w:r>
-              <w:rPr/>
-              <w:t xml:space="preserve">0.68150897</w:t>
+              <w:t xml:space="preserve">0.34025443</w:t>
+            </w:r>
+          </w:p>
+        </w:tc>
+        <w:tc>
+          <w:tcPr/>
+          <w:p>
+            <w:r>
+              <w:rPr/>
+              <w:t xml:space="preserve">0.99987795</w:t>
+            </w:r>
+          </w:p>
+        </w:tc>
+        <w:tc>
+          <w:tcPr/>
+          <w:p>
+            <w:r>
+              <w:rPr/>
+              <w:t xml:space="preserve">0.68822254</w:t>
+            </w:r>
+          </w:p>
+        </w:tc>
+        <w:tc>
+          <w:tcPr/>
+          <w:p>
+            <w:r>
+              <w:rPr/>
+              <w:t xml:space="preserve">False</w:t>
+            </w:r>
+          </w:p>
+        </w:tc>
+      </w:tr>
+      <w:tr>
+        <w:tc>
+          <w:tcPr/>
+          <w:p>
+            <w:r>
+              <w:rPr/>
+              <w:t xml:space="preserve">3</w:t>
+            </w:r>
+          </w:p>
+        </w:tc>
+        <w:tc>
+          <w:tcPr/>
+          <w:p>
+            <w:r>
+              <w:rPr/>
+              <w:t xml:space="preserve">0.22514742</w:t>
+            </w:r>
+          </w:p>
+        </w:tc>
+        <w:tc>
+          <w:tcPr/>
+          <w:p>
+            <w:r>
+              <w:rPr/>
+              <w:t xml:space="preserve">0.87603194</w:t>
+            </w:r>
+          </w:p>
+        </w:tc>
+        <w:tc>
+          <w:tcPr/>
+          <w:p>
+            <w:r>
+              <w:rPr/>
+              <w:t xml:space="preserve">0.68595321</w:t>
+            </w:r>
+          </w:p>
+        </w:tc>
+        <w:tc>
+          <w:tcPr/>
+          <w:p>
+            <w:r>
+              <w:rPr/>
+              <w:t xml:space="preserve">False</w:t>
+            </w:r>
+          </w:p>
+        </w:tc>
+      </w:tr>
+      <w:tr>
+        <w:tc>
+          <w:tcPr/>
+          <w:p>
+            <w:r>
+              <w:rPr/>
+              <w:t xml:space="preserve">4</w:t>
+            </w:r>
+          </w:p>
+        </w:tc>
+        <w:tc>
+          <w:tcPr/>
+          <w:p>
+            <w:r>
+              <w:rPr/>
+              <w:t xml:space="preserve">0.1527805</w:t>
+            </w:r>
+          </w:p>
+        </w:tc>
+        <w:tc>
+          <w:tcPr/>
+          <w:p>
+            <w:r>
+              <w:rPr/>
+              <w:t xml:space="preserve">0.89848944</w:t>
+            </w:r>
+          </w:p>
+        </w:tc>
+        <w:tc>
+          <w:tcPr/>
+          <w:p>
+            <w:r>
+              <w:rPr/>
+              <w:t xml:space="preserve">0.68654914</w:t>
+            </w:r>
+          </w:p>
+        </w:tc>
+        <w:tc>
+          <w:tcPr/>
+          <w:p>
+            <w:r>
+              <w:rPr/>
+              <w:t xml:space="preserve">False</w:t>
+            </w:r>
+          </w:p>
+        </w:tc>
+      </w:tr>
+      <w:tr>
+        <w:tc>
+          <w:tcPr/>
+          <w:p>
+            <w:r>
+              <w:rPr/>
+              <w:t xml:space="preserve">5</w:t>
+            </w:r>
+          </w:p>
+        </w:tc>
+        <w:tc>
+          <w:tcPr/>
+          <w:p>
+            <w:r>
+              <w:rPr/>
+              <w:t xml:space="preserve">0.15589811</w:t>
+            </w:r>
+          </w:p>
+        </w:tc>
+        <w:tc>
+          <w:tcPr/>
+          <w:p>
+            <w:r>
+              <w:rPr/>
+              <w:t xml:space="preserve">0.96413299</w:t>
+            </w:r>
+          </w:p>
+        </w:tc>
+        <w:tc>
+          <w:tcPr/>
+          <w:p>
+            <w:r>
+              <w:rPr/>
+              <w:t xml:space="preserve">0.68702432</w:t>
+            </w:r>
+          </w:p>
+        </w:tc>
+        <w:tc>
+          <w:tcPr/>
+          <w:p>
+            <w:r>
+              <w:rPr/>
+              <w:t xml:space="preserve">False</w:t>
+            </w:r>
+          </w:p>
+        </w:tc>
+      </w:tr>
+      <w:tr>
+        <w:tc>
+          <w:tcPr/>
+          <w:p>
+            <w:r>
+              <w:rPr/>
+              <w:t xml:space="preserve">6</w:t>
+            </w:r>
+          </w:p>
+        </w:tc>
+        <w:tc>
+          <w:tcPr/>
+          <w:p>
+            <w:r>
+              <w:rPr/>
+              <w:t xml:space="preserve">0.12100706</w:t>
+            </w:r>
+          </w:p>
+        </w:tc>
+        <w:tc>
+          <w:tcPr/>
+          <w:p>
+            <w:r>
+              <w:rPr/>
+              <w:t xml:space="preserve">0.98698016</w:t>
+            </w:r>
+          </w:p>
+        </w:tc>
+        <w:tc>
+          <w:tcPr/>
+          <w:p>
+            <w:r>
+              <w:rPr/>
+              <w:t xml:space="preserve">0.68558806</w:t>
             </w:r>
           </w:p>
         </w:tc>
@@ -1620,34 +2579,34 @@
           <w:p>
             <w:r>
               <w:rPr/>
-              <w:t xml:space="preserve">3</w:t>
-            </w:r>
-          </w:p>
-        </w:tc>
-        <w:tc>
-          <w:tcPr/>
-          <w:p>
-            <w:r>
-              <w:rPr/>
-              <w:t xml:space="preserve">3.224822</w:t>
-            </w:r>
-          </w:p>
-        </w:tc>
-        <w:tc>
-          <w:tcPr/>
-          <w:p>
-            <w:r>
-              <w:rPr/>
-              <w:t xml:space="preserve">0.3325229</w:t>
-            </w:r>
-          </w:p>
-        </w:tc>
-        <w:tc>
-          <w:tcPr/>
-          <w:p>
-            <w:r>
-              <w:rPr/>
-              <w:t xml:space="preserve">0.68150897</w:t>
+              <w:t xml:space="preserve">7</w:t>
+            </w:r>
+          </w:p>
+        </w:tc>
+        <w:tc>
+          <w:tcPr/>
+          <w:p>
+            <w:r>
+              <w:rPr/>
+              <w:t xml:space="preserve">0.11684123</w:t>
+            </w:r>
+          </w:p>
+        </w:tc>
+        <w:tc>
+          <w:tcPr/>
+          <w:p>
+            <w:r>
+              <w:rPr/>
+              <w:t xml:space="preserve">0.93715975</w:t>
+            </w:r>
+          </w:p>
+        </w:tc>
+        <w:tc>
+          <w:tcPr/>
+          <w:p>
+            <w:r>
+              <w:rPr/>
+              <w:t xml:space="preserve">0.71229033</w:t>
             </w:r>
           </w:p>
         </w:tc>
@@ -1667,194 +2626,6 @@
           <w:p>
             <w:r>
               <w:rPr/>
-              <w:t xml:space="preserve">4</w:t>
-            </w:r>
-          </w:p>
-        </w:tc>
-        <w:tc>
-          <w:tcPr/>
-          <w:p>
-            <w:r>
-              <w:rPr/>
-              <w:t xml:space="preserve">3.224822</w:t>
-            </w:r>
-          </w:p>
-        </w:tc>
-        <w:tc>
-          <w:tcPr/>
-          <w:p>
-            <w:r>
-              <w:rPr/>
-              <w:t xml:space="preserve">0.24939217</w:t>
-            </w:r>
-          </w:p>
-        </w:tc>
-        <w:tc>
-          <w:tcPr/>
-          <w:p>
-            <w:r>
-              <w:rPr/>
-              <w:t xml:space="preserve">0.68150897</w:t>
-            </w:r>
-          </w:p>
-        </w:tc>
-        <w:tc>
-          <w:tcPr/>
-          <w:p>
-            <w:r>
-              <w:rPr/>
-              <w:t xml:space="preserve">False</w:t>
-            </w:r>
-          </w:p>
-        </w:tc>
-      </w:tr>
-      <w:tr>
-        <w:tc>
-          <w:tcPr/>
-          <w:p>
-            <w:r>
-              <w:rPr/>
-              <w:t xml:space="preserve">5</w:t>
-            </w:r>
-          </w:p>
-        </w:tc>
-        <w:tc>
-          <w:tcPr/>
-          <w:p>
-            <w:r>
-              <w:rPr/>
-              <w:t xml:space="preserve">3.224822</w:t>
-            </w:r>
-          </w:p>
-        </w:tc>
-        <w:tc>
-          <w:tcPr/>
-          <w:p>
-            <w:r>
-              <w:rPr/>
-              <w:t xml:space="preserve">0.19951374</w:t>
-            </w:r>
-          </w:p>
-        </w:tc>
-        <w:tc>
-          <w:tcPr/>
-          <w:p>
-            <w:r>
-              <w:rPr/>
-              <w:t xml:space="preserve">0.68150897</w:t>
-            </w:r>
-          </w:p>
-        </w:tc>
-        <w:tc>
-          <w:tcPr/>
-          <w:p>
-            <w:r>
-              <w:rPr/>
-              <w:t xml:space="preserve">False</w:t>
-            </w:r>
-          </w:p>
-        </w:tc>
-      </w:tr>
-      <w:tr>
-        <w:tc>
-          <w:tcPr/>
-          <w:p>
-            <w:r>
-              <w:rPr/>
-              <w:t xml:space="preserve">6</w:t>
-            </w:r>
-          </w:p>
-        </w:tc>
-        <w:tc>
-          <w:tcPr/>
-          <w:p>
-            <w:r>
-              <w:rPr/>
-              <w:t xml:space="preserve">3.224822</w:t>
-            </w:r>
-          </w:p>
-        </w:tc>
-        <w:tc>
-          <w:tcPr/>
-          <w:p>
-            <w:r>
-              <w:rPr/>
-              <w:t xml:space="preserve">0.16626145</w:t>
-            </w:r>
-          </w:p>
-        </w:tc>
-        <w:tc>
-          <w:tcPr/>
-          <w:p>
-            <w:r>
-              <w:rPr/>
-              <w:t xml:space="preserve">0.68150897</w:t>
-            </w:r>
-          </w:p>
-        </w:tc>
-        <w:tc>
-          <w:tcPr/>
-          <w:p>
-            <w:r>
-              <w:rPr/>
-              <w:t xml:space="preserve">False</w:t>
-            </w:r>
-          </w:p>
-        </w:tc>
-      </w:tr>
-      <w:tr>
-        <w:tc>
-          <w:tcPr/>
-          <w:p>
-            <w:r>
-              <w:rPr/>
-              <w:t xml:space="preserve">7</w:t>
-            </w:r>
-          </w:p>
-        </w:tc>
-        <w:tc>
-          <w:tcPr/>
-          <w:p>
-            <w:r>
-              <w:rPr/>
-              <w:t xml:space="preserve">3.224822</w:t>
-            </w:r>
-          </w:p>
-        </w:tc>
-        <w:tc>
-          <w:tcPr/>
-          <w:p>
-            <w:r>
-              <w:rPr/>
-              <w:t xml:space="preserve">0.14250981</w:t>
-            </w:r>
-          </w:p>
-        </w:tc>
-        <w:tc>
-          <w:tcPr/>
-          <w:p>
-            <w:r>
-              <w:rPr/>
-              <w:t xml:space="preserve">0.68150897</w:t>
-            </w:r>
-          </w:p>
-        </w:tc>
-        <w:tc>
-          <w:tcPr/>
-          <w:p>
-            <w:r>
-              <w:rPr/>
-              <w:t xml:space="preserve">False</w:t>
-            </w:r>
-          </w:p>
-        </w:tc>
-      </w:tr>
-      <w:tr>
-        <w:tc>
-          <w:tcPr/>
-          <w:p>
-            <w:r>
-              <w:rPr/>
               <w:t xml:space="preserve">8</w:t>
             </w:r>
           </w:p>
@@ -1864,25 +2635,25 @@
           <w:p>
             <w:r>
               <w:rPr/>
-              <w:t xml:space="preserve">3.224822</w:t>
-            </w:r>
-          </w:p>
-        </w:tc>
-        <w:tc>
-          <w:tcPr/>
-          <w:p>
-            <w:r>
-              <w:rPr/>
-              <w:t xml:space="preserve">0.12469609</w:t>
-            </w:r>
-          </w:p>
-        </w:tc>
-        <w:tc>
-          <w:tcPr/>
-          <w:p>
-            <w:r>
-              <w:rPr/>
-              <w:t xml:space="preserve">0.68150897</w:t>
+              <w:t xml:space="preserve">0.12544893</w:t>
+            </w:r>
+          </w:p>
+        </w:tc>
+        <w:tc>
+          <w:tcPr/>
+          <w:p>
+            <w:r>
+              <w:rPr/>
+              <w:t xml:space="preserve">0.92848186</w:t>
+            </w:r>
+          </w:p>
+        </w:tc>
+        <w:tc>
+          <w:tcPr/>
+          <w:p>
+            <w:r>
+              <w:rPr/>
+              <w:t xml:space="preserve">0.74271379</w:t>
             </w:r>
           </w:p>
         </w:tc>
@@ -2011,6 +2782,138 @@
                   </pic:nvPicPr>
                   <pic:blipFill>
                     <a:blip r:embed="rId8"/>
+                    <a:stretch>
+                      <a:fillRect/>
+                    </a:stretch>
+                  </pic:blipFill>
+                  <pic:spPr>
+                    <a:xfrm>
+                      <a:off x="0" y="0"/>
+                      <a:ext cx="5394960" cy="2834640"/>
+                    </a:xfrm>
+                    <a:prstGeom prst="rect"/>
+                  </pic:spPr>
+                </pic:pic>
+              </a:graphicData>
+            </a:graphic>
+          </wp:inline>
+        </w:drawing>
+      </w:r>
+    </w:p>
+    <w:p>
+      <w:r>
+        <w:drawing>
+          <wp:inline distT="0" distB="0" distL="0" distR="0">
+            <wp:extent cx="5394960" cy="2834640"/>
+            <wp:docPr id="110" name="parafac_component3"/>
+            <a:graphic xmlns:a="http://schemas.openxmlformats.org/drawingml/2006/main">
+              <a:graphicData uri="http://schemas.openxmlformats.org/drawingml/2006/picture">
+                <pic:pic xmlns:pic="http://schemas.openxmlformats.org/drawingml/2006/picture">
+                  <pic:nvPicPr>
+                    <pic:cNvPr id="0" name="parafac_component3.svg"/>
+                    <pic:cNvPicPr/>
+                  </pic:nvPicPr>
+                  <pic:blipFill>
+                    <a:blip r:embed="rId9"/>
+                    <a:stretch>
+                      <a:fillRect/>
+                    </a:stretch>
+                  </pic:blipFill>
+                  <pic:spPr>
+                    <a:xfrm>
+                      <a:off x="0" y="0"/>
+                      <a:ext cx="5394960" cy="2834640"/>
+                    </a:xfrm>
+                    <a:prstGeom prst="rect"/>
+                  </pic:spPr>
+                </pic:pic>
+              </a:graphicData>
+            </a:graphic>
+          </wp:inline>
+        </w:drawing>
+      </w:r>
+    </w:p>
+    <w:p>
+      <w:r>
+        <w:drawing>
+          <wp:inline distT="0" distB="0" distL="0" distR="0">
+            <wp:extent cx="5394960" cy="2834640"/>
+            <wp:docPr id="111" name="parafac_component4"/>
+            <a:graphic xmlns:a="http://schemas.openxmlformats.org/drawingml/2006/main">
+              <a:graphicData uri="http://schemas.openxmlformats.org/drawingml/2006/picture">
+                <pic:pic xmlns:pic="http://schemas.openxmlformats.org/drawingml/2006/picture">
+                  <pic:nvPicPr>
+                    <pic:cNvPr id="0" name="parafac_component4.svg"/>
+                    <pic:cNvPicPr/>
+                  </pic:nvPicPr>
+                  <pic:blipFill>
+                    <a:blip r:embed="rId10"/>
+                    <a:stretch>
+                      <a:fillRect/>
+                    </a:stretch>
+                  </pic:blipFill>
+                  <pic:spPr>
+                    <a:xfrm>
+                      <a:off x="0" y="0"/>
+                      <a:ext cx="5394960" cy="2834640"/>
+                    </a:xfrm>
+                    <a:prstGeom prst="rect"/>
+                  </pic:spPr>
+                </pic:pic>
+              </a:graphicData>
+            </a:graphic>
+          </wp:inline>
+        </w:drawing>
+      </w:r>
+    </w:p>
+    <w:p>
+      <w:r>
+        <w:drawing>
+          <wp:inline distT="0" distB="0" distL="0" distR="0">
+            <wp:extent cx="5394960" cy="2834640"/>
+            <wp:docPr id="112" name="parafac_component5"/>
+            <a:graphic xmlns:a="http://schemas.openxmlformats.org/drawingml/2006/main">
+              <a:graphicData uri="http://schemas.openxmlformats.org/drawingml/2006/picture">
+                <pic:pic xmlns:pic="http://schemas.openxmlformats.org/drawingml/2006/picture">
+                  <pic:nvPicPr>
+                    <pic:cNvPr id="0" name="parafac_component5.svg"/>
+                    <pic:cNvPicPr/>
+                  </pic:nvPicPr>
+                  <pic:blipFill>
+                    <a:blip r:embed="rId11"/>
+                    <a:stretch>
+                      <a:fillRect/>
+                    </a:stretch>
+                  </pic:blipFill>
+                  <pic:spPr>
+                    <a:xfrm>
+                      <a:off x="0" y="0"/>
+                      <a:ext cx="5394960" cy="2834640"/>
+                    </a:xfrm>
+                    <a:prstGeom prst="rect"/>
+                  </pic:spPr>
+                </pic:pic>
+              </a:graphicData>
+            </a:graphic>
+          </wp:inline>
+        </w:drawing>
+      </w:r>
+    </w:p>
+    <w:p>
+      <w:r>
+        <w:drawing>
+          <wp:inline distT="0" distB="0" distL="0" distR="0">
+            <wp:extent cx="5394960" cy="2834640"/>
+            <wp:docPr id="113" name="parafac_component6"/>
+            <a:graphic xmlns:a="http://schemas.openxmlformats.org/drawingml/2006/main">
+              <a:graphicData uri="http://schemas.openxmlformats.org/drawingml/2006/picture">
+                <pic:pic xmlns:pic="http://schemas.openxmlformats.org/drawingml/2006/picture">
+                  <pic:nvPicPr>
+                    <pic:cNvPr id="0" name="parafac_component6.svg"/>
+                    <pic:cNvPicPr/>
+                  </pic:nvPicPr>
+                  <pic:blipFill>
+                    <a:blip r:embed="rId12"/>
                     <a:stretch>
                       <a:fillRect/>
                     </a:stretch>

</xml_diff>

<commit_message>
Improve report explanations and figure styling
</commit_message>
<xml_diff>
--- a/supervised_monosaccharides_exclude_rha5/monosaccharide_softsensor_exclude_rha5_refined_dependencies_report.docx
+++ b/supervised_monosaccharides_exclude_rha5/monosaccharide_softsensor_exclude_rha5_refined_dependencies_report.docx
@@ -74,6 +74,14 @@
     </w:p>
     <w:p>
       <w:r>
+        <w:rPr>
+          <w:i/>
+        </w:rPr>
+        <w:t xml:space="preserve">Figure 1. Detailed soft-sensor pipeline. Raman spectra provide direct carbohydrate information; EEM/PARAFAC features capture fluorescence and process-state information.</w:t>
+      </w:r>
+    </w:p>
+    <w:p>
+      <w:r>
         <w:br w:type="page"/>
       </w:r>
     </w:p>
@@ -275,6 +283,11 @@
     <w:p>
       <w:r>
         <w:t xml:space="preserve">The pipeline starts with raw EEM matrices and Raman spectra copied into the repository. The inventory builder joins raw files with metadata workbooks and treatment legends. Feature export then creates compact interpretable features and high-dimensional spectral matrices. Recent preprocessing additions make the Raman branch more chemically defensible and the EEM branch more suitable for component interpretation.</w:t>
+      </w:r>
+    </w:p>
+    <w:p>
+      <w:r>
+        <w:t xml:space="preserve">For a newcomer: the SciPy Raman path uses established scientific routines. ALS estimates and removes a smooth background; Savitzky-Golay smoothing reduces noise while preserving peak shape; SNV rescales each spectrum so models compare spectral shape rather than brightness.</w:t>
       </w:r>
     </w:p>
     <w:tbl>
@@ -1114,6 +1127,14 @@
     </w:p>
     <w:p>
       <w:r>
+        <w:rPr>
+          <w:i/>
+        </w:rPr>
+        <w:t xml:space="preserve">Figure 2. RMSE comparison. The y-axis is RMSE in g/L, so lower bars indicate better concentration prediction.</w:t>
+      </w:r>
+    </w:p>
+    <w:p>
+      <w:r>
         <w:t xml:space="preserve">The current project-level best models are not identical across targets, which is biologically plausible. Rhamnose benefits most from Raman + EEM full fusion, suggesting that direct Raman sugar information and EEM matrix-state information are both useful. Xylose is best with full EEM features and Laplacian kernel ridge regression, possibly reflecting strong covariance with fluorescence/process-state patterns in the standards/spikes. Glucose is best in the original search with compact EEM interpretable features, but the later preprocessed Raman kernel-ridge model improves glucose RMSE to 0.5094 g/L.</w:t>
       </w:r>
     </w:p>
@@ -1151,6 +1172,14 @@
       </w:r>
     </w:p>
     <w:p>
+      <w:r>
+        <w:rPr>
+          <w:i/>
+        </w:rPr>
+        <w:t xml:space="preserve">Figure 3. Predicted versus true concentrations. Points close to the diagonal indicate better agreement between model prediction and known standard/spike concentration.</w:t>
+      </w:r>
+    </w:p>
+    <w:p>
       <w:pPr>
         <w:pStyle w:val="Heading2"/>
       </w:pPr>
@@ -2266,6 +2295,14 @@
         </w:drawing>
       </w:r>
     </w:p>
+    <w:p>
+      <w:r>
+        <w:rPr>
+          <w:i/>
+        </w:rPr>
+        <w:t xml:space="preserve">Figure 4. Additional improvement from preprocessing and PARAFAC features relative to the current baseline. Positive values indicate lower RMSE.</w:t>
+      </w:r>
+    </w:p>
     <w:tbl>
       <w:tblPr>
         <w:tblStyle w:val="TableGrid"/>
@@ -2703,6 +2740,14 @@
     </w:p>
     <w:p>
       <w:r>
+        <w:rPr>
+          <w:i/>
+        </w:rPr>
+        <w:t xml:space="preserve">PARAFAC visualisation: rank6_excitation_loadings. Excitation and emission plots show wavelength loadings; component maps show the fluorescence pattern represented by one component.</w:t>
+      </w:r>
+    </w:p>
+    <w:p>
+      <w:r>
         <w:drawing>
           <wp:inline distT="0" distB="0" distL="0" distR="0">
             <wp:extent cx="5394960" cy="2834640"/>
@@ -2736,6 +2781,14 @@
     </w:p>
     <w:p>
       <w:r>
+        <w:rPr>
+          <w:i/>
+        </w:rPr>
+        <w:t xml:space="preserve">PARAFAC visualisation: rank6_emission_loadings. Excitation and emission plots show wavelength loadings; component maps show the fluorescence pattern represented by one component.</w:t>
+      </w:r>
+    </w:p>
+    <w:p>
+      <w:r>
         <w:drawing>
           <wp:inline distT="0" distB="0" distL="0" distR="0">
             <wp:extent cx="5394960" cy="2834640"/>
@@ -2769,6 +2822,14 @@
     </w:p>
     <w:p>
       <w:r>
+        <w:rPr>
+          <w:i/>
+        </w:rPr>
+        <w:t xml:space="preserve">PARAFAC visualisation: rank6_component1_map. Excitation and emission plots show wavelength loadings; component maps show the fluorescence pattern represented by one component.</w:t>
+      </w:r>
+    </w:p>
+    <w:p>
+      <w:r>
         <w:drawing>
           <wp:inline distT="0" distB="0" distL="0" distR="0">
             <wp:extent cx="5394960" cy="2834640"/>
@@ -2802,6 +2863,14 @@
     </w:p>
     <w:p>
       <w:r>
+        <w:rPr>
+          <w:i/>
+        </w:rPr>
+        <w:t xml:space="preserve">PARAFAC visualisation: rank6_component2_map. Excitation and emission plots show wavelength loadings; component maps show the fluorescence pattern represented by one component.</w:t>
+      </w:r>
+    </w:p>
+    <w:p>
+      <w:r>
         <w:drawing>
           <wp:inline distT="0" distB="0" distL="0" distR="0">
             <wp:extent cx="5394960" cy="2834640"/>
@@ -2835,6 +2904,14 @@
     </w:p>
     <w:p>
       <w:r>
+        <w:rPr>
+          <w:i/>
+        </w:rPr>
+        <w:t xml:space="preserve">PARAFAC visualisation: rank6_component3_map. Excitation and emission plots show wavelength loadings; component maps show the fluorescence pattern represented by one component.</w:t>
+      </w:r>
+    </w:p>
+    <w:p>
+      <w:r>
         <w:drawing>
           <wp:inline distT="0" distB="0" distL="0" distR="0">
             <wp:extent cx="5394960" cy="2834640"/>
@@ -2868,6 +2945,14 @@
     </w:p>
     <w:p>
       <w:r>
+        <w:rPr>
+          <w:i/>
+        </w:rPr>
+        <w:t xml:space="preserve">PARAFAC visualisation: rank6_component4_map. Excitation and emission plots show wavelength loadings; component maps show the fluorescence pattern represented by one component.</w:t>
+      </w:r>
+    </w:p>
+    <w:p>
+      <w:r>
         <w:drawing>
           <wp:inline distT="0" distB="0" distL="0" distR="0">
             <wp:extent cx="5394960" cy="2834640"/>
@@ -2901,6 +2986,14 @@
     </w:p>
     <w:p>
       <w:r>
+        <w:rPr>
+          <w:i/>
+        </w:rPr>
+        <w:t xml:space="preserve">PARAFAC visualisation: rank6_component5_map. Excitation and emission plots show wavelength loadings; component maps show the fluorescence pattern represented by one component.</w:t>
+      </w:r>
+    </w:p>
+    <w:p>
+      <w:r>
         <w:drawing>
           <wp:inline distT="0" distB="0" distL="0" distR="0">
             <wp:extent cx="5394960" cy="2834640"/>
@@ -2930,6 +3023,14 @@
             </a:graphic>
           </wp:inline>
         </w:drawing>
+      </w:r>
+    </w:p>
+    <w:p>
+      <w:r>
+        <w:rPr>
+          <w:i/>
+        </w:rPr>
+        <w:t xml:space="preserve">PARAFAC visualisation: rank6_component6_map. Excitation and emission plots show wavelength loadings; component maps show the fluorescence pattern represented by one component.</w:t>
       </w:r>
     </w:p>
     <w:p>

</xml_diff>

<commit_message>
Fix filtered report dependency results and scatter plots
</commit_message>
<xml_diff>
--- a/supervised_monosaccharides_exclude_rha5/monosaccharide_softsensor_exclude_rha5_refined_dependencies_report.docx
+++ b/supervised_monosaccharides_exclude_rha5/monosaccharide_softsensor_exclude_rha5_refined_dependencies_report.docx
@@ -1189,7 +1189,266 @@
     </w:p>
     <w:p>
       <w:r>
-        <w:t xml:space="preserve">This comparison uses Conda base packages when available: scikit-learn PLSR/SVR and XGBoost.</w:t>
+        <w:t xml:space="preserve">This comparison uses Conda base packages when available: scikit-learn PLSR/SVR and XGBoost. The first table shows the best dependency-backed result for each target so strong target-specific results are not hidden by CSV ordering.</w:t>
+      </w:r>
+    </w:p>
+    <w:tbl>
+      <w:tblPr>
+        <w:tblStyle w:val="TableGrid"/>
+        <w:tblW w:w="0" w:type="auto"/>
+      </w:tblPr>
+      <w:tr>
+        <w:tc>
+          <w:tcPr>
+            <w:shd w:fill="EEF3F8"/>
+          </w:tcPr>
+          <w:p>
+            <w:r>
+              <w:rPr>
+                <w:b/>
+              </w:rPr>
+              <w:t xml:space="preserve">Target</w:t>
+            </w:r>
+          </w:p>
+        </w:tc>
+        <w:tc>
+          <w:tcPr>
+            <w:shd w:fill="EEF3F8"/>
+          </w:tcPr>
+          <w:p>
+            <w:r>
+              <w:rPr>
+                <w:b/>
+              </w:rPr>
+              <w:t xml:space="preserve">Feature set</w:t>
+            </w:r>
+          </w:p>
+        </w:tc>
+        <w:tc>
+          <w:tcPr>
+            <w:shd w:fill="EEF3F8"/>
+          </w:tcPr>
+          <w:p>
+            <w:r>
+              <w:rPr>
+                <w:b/>
+              </w:rPr>
+              <w:t xml:space="preserve">Model</w:t>
+            </w:r>
+          </w:p>
+        </w:tc>
+        <w:tc>
+          <w:tcPr>
+            <w:shd w:fill="EEF3F8"/>
+          </w:tcPr>
+          <w:p>
+            <w:r>
+              <w:rPr>
+                <w:b/>
+              </w:rPr>
+              <w:t xml:space="preserve">Config</w:t>
+            </w:r>
+          </w:p>
+        </w:tc>
+        <w:tc>
+          <w:tcPr>
+            <w:shd w:fill="EEF3F8"/>
+          </w:tcPr>
+          <w:p>
+            <w:r>
+              <w:rPr>
+                <w:b/>
+              </w:rPr>
+              <w:t xml:space="preserve">RMSE</w:t>
+            </w:r>
+          </w:p>
+        </w:tc>
+        <w:tc>
+          <w:tcPr>
+            <w:shd w:fill="EEF3F8"/>
+          </w:tcPr>
+          <w:p>
+            <w:r>
+              <w:rPr>
+                <w:b/>
+              </w:rPr>
+              <w:t xml:space="preserve">R2</w:t>
+            </w:r>
+          </w:p>
+        </w:tc>
+      </w:tr>
+      <w:tr>
+        <w:tc>
+          <w:tcPr/>
+          <w:p>
+            <w:r>
+              <w:rPr/>
+              <w:t xml:space="preserve">Rhamnose</w:t>
+            </w:r>
+          </w:p>
+        </w:tc>
+        <w:tc>
+          <w:tcPr/>
+          <w:p>
+            <w:r>
+              <w:rPr/>
+              <w:t xml:space="preserve">fusion_full</w:t>
+            </w:r>
+          </w:p>
+        </w:tc>
+        <w:tc>
+          <w:tcPr/>
+          <w:p>
+            <w:r>
+              <w:rPr/>
+              <w:t xml:space="preserve">sklearn_plsr</w:t>
+            </w:r>
+          </w:p>
+        </w:tc>
+        <w:tc>
+          <w:tcPr/>
+          <w:p>
+            <w:r>
+              <w:rPr/>
+              <w:t xml:space="preserve">n_components=5,max_features=192</w:t>
+            </w:r>
+          </w:p>
+        </w:tc>
+        <w:tc>
+          <w:tcPr/>
+          <w:p>
+            <w:r>
+              <w:rPr/>
+              <w:t xml:space="preserve">0.3598</w:t>
+            </w:r>
+          </w:p>
+        </w:tc>
+        <w:tc>
+          <w:tcPr/>
+          <w:p>
+            <w:r>
+              <w:rPr/>
+              <w:t xml:space="preserve">0.063</w:t>
+            </w:r>
+          </w:p>
+        </w:tc>
+      </w:tr>
+      <w:tr>
+        <w:tc>
+          <w:tcPr/>
+          <w:p>
+            <w:r>
+              <w:rPr/>
+              <w:t xml:space="preserve">Xylose</w:t>
+            </w:r>
+          </w:p>
+        </w:tc>
+        <w:tc>
+          <w:tcPr/>
+          <w:p>
+            <w:r>
+              <w:rPr/>
+              <w:t xml:space="preserve">fusion_interpretable</w:t>
+            </w:r>
+          </w:p>
+        </w:tc>
+        <w:tc>
+          <w:tcPr/>
+          <w:p>
+            <w:r>
+              <w:rPr/>
+              <w:t xml:space="preserve">sklearn_svr</w:t>
+            </w:r>
+          </w:p>
+        </w:tc>
+        <w:tc>
+          <w:tcPr/>
+          <w:p>
+            <w:r>
+              <w:rPr/>
+              <w:t xml:space="preserve">kernel=rbf,C=10,epsilon=0.05,max_features=192</w:t>
+            </w:r>
+          </w:p>
+        </w:tc>
+        <w:tc>
+          <w:tcPr/>
+          <w:p>
+            <w:r>
+              <w:rPr/>
+              <w:t xml:space="preserve">0.4411</w:t>
+            </w:r>
+          </w:p>
+        </w:tc>
+        <w:tc>
+          <w:tcPr/>
+          <w:p>
+            <w:r>
+              <w:rPr/>
+              <w:t xml:space="preserve">-0.257</w:t>
+            </w:r>
+          </w:p>
+        </w:tc>
+      </w:tr>
+      <w:tr>
+        <w:tc>
+          <w:tcPr/>
+          <w:p>
+            <w:r>
+              <w:rPr/>
+              <w:t xml:space="preserve">Glucose</w:t>
+            </w:r>
+          </w:p>
+        </w:tc>
+        <w:tc>
+          <w:tcPr/>
+          <w:p>
+            <w:r>
+              <w:rPr/>
+              <w:t xml:space="preserve">fusion_full</w:t>
+            </w:r>
+          </w:p>
+        </w:tc>
+        <w:tc>
+          <w:tcPr/>
+          <w:p>
+            <w:r>
+              <w:rPr/>
+              <w:t xml:space="preserve">sklearn_svr</w:t>
+            </w:r>
+          </w:p>
+        </w:tc>
+        <w:tc>
+          <w:tcPr/>
+          <w:p>
+            <w:r>
+              <w:rPr/>
+              <w:t xml:space="preserve">kernel=rbf,C=10,epsilon=0.05,max_features=192</w:t>
+            </w:r>
+          </w:p>
+        </w:tc>
+        <w:tc>
+          <w:tcPr/>
+          <w:p>
+            <w:r>
+              <w:rPr/>
+              <w:t xml:space="preserve">0.6256</w:t>
+            </w:r>
+          </w:p>
+        </w:tc>
+        <w:tc>
+          <w:tcPr/>
+          <w:p>
+            <w:r>
+              <w:rPr/>
+              <w:t xml:space="preserve">-0.134</w:t>
+            </w:r>
+          </w:p>
+        </w:tc>
+      </w:tr>
+    </w:tbl>
+    <w:p>
+      <w:r>
+        <w:t xml:space="preserve">Top dependency-backed rows by RMSE:</w:t>
       </w:r>
     </w:p>
     <w:tbl>

</xml_diff>